<commit_message>
Docs/scripts: phonetic-only pivot - remove all acoustic/Chromaprint/fpcalc references
- README.md: rewritten for phonetic-only approach (dialogue matching via
  subtitles + STT), removed hybrid/acoustic sections, updated component
  table, GUI description, and install table
- INSTALL_WINDOWS.md: rewritten as phonetic setup guide (Python, FFmpeg,
  Vosk model), regenerated .docx/.pdf
- USAGE_DVD.md: rewritten for phonetic-only workflow, added --workers
  parallel processing docs, regenerated .docx/.pdf
- install.ps1: removed Chromaprint/fpcalc winget install step, updated
  step numbering, removed fpcalc from PATH verification
- install.bat: updated description text
- build_msix.ps1: removed fpcalc.exe from bundle loop, updated comments
- Deleted: install_chromaprint.ps1, install_chromaprint.bat (no longer needed)
</commit_message>
<xml_diff>
--- a/USAGE_DVD.docx
+++ b/USAGE_DVD.docx
@@ -63,7 +63,7 @@
           <w:iCs/>
           <w:i/>
         </w:rPr>
-        <w:t xml:space="preserve">of episode files ripped from DVDs — they’re out of order, some are extended cuts,</w:t>
+        <w:t xml:space="preserve">of episode files ripped from DVDs - they’re out of order, some are extended cuts,</w:t>
       </w:r>
       <w:r>
         <w:rPr>
@@ -106,7 +106,7 @@
         <w:pStyle w:val="BodyText"/>
       </w:pPr>
       <w:r>
-        <w:t xml:space="preserve">It uses one small script —</w:t>
+        <w:t xml:space="preserve">It uses one small script -</w:t>
       </w:r>
       <w:r>
         <w:t xml:space="preserve"> </w:t>
@@ -123,7 +123,7 @@
         <w:t xml:space="preserve"> </w:t>
       </w:r>
       <w:r>
-        <w:t xml:space="preserve">— and a reference</w:t>
+        <w:t xml:space="preserve">- and a reference</w:t>
       </w:r>
       <w:r>
         <w:t xml:space="preserve"> </w:t>
@@ -177,7 +177,7 @@
         </w:pict>
       </w:r>
     </w:p>
-    <w:bookmarkStart w:id="20" w:name="how-it-works-and-why"/>
+    <w:bookmarkStart w:id="21" w:name="how-it-works-and-why"/>
     <w:p>
       <w:pPr>
         <w:pStyle w:val="Heading2"/>
@@ -245,25 +245,13 @@
           <w:bCs/>
           <w:b/>
         </w:rPr>
-        <w:t xml:space="preserve">Acoustic-fingerprints each clip</w:t>
-      </w:r>
-      <w:r>
-        <w:t xml:space="preserve"> </w:t>
-      </w:r>
-      <w:r>
-        <w:t xml:space="preserve">(Chromaprint) and matches it against the</w:t>
-      </w:r>
-      <w:r>
-        <w:t xml:space="preserve"> </w:t>
-      </w:r>
-      <w:r>
-        <w:t xml:space="preserve">reference DB. DVD audio is a near-clean copy of the broadcast audio, so this</w:t>
-      </w:r>
-      <w:r>
-        <w:t xml:space="preserve"> </w:t>
-      </w:r>
-      <w:r>
-        <w:t xml:space="preserve">is fast and precise.</w:t>
+        <w:t xml:space="preserve">Transcribes each clip</w:t>
+      </w:r>
+      <w:r>
+        <w:t xml:space="preserve"> </w:t>
+      </w:r>
+      <w:r>
+        <w:t xml:space="preserve">using the Vosk offline speech-to-text engine.</w:t>
       </w:r>
     </w:p>
     <w:p>
@@ -279,43 +267,19 @@
           <w:bCs/>
           <w:b/>
         </w:rPr>
-        <w:t xml:space="preserve">Votes</w:t>
-      </w:r>
-      <w:r>
-        <w:t xml:space="preserve"> </w:t>
-      </w:r>
-      <w:r>
-        <w:t xml:space="preserve">across the samples. Requiring several spread-out clips to agree</w:t>
-      </w:r>
-      <w:r>
-        <w:t xml:space="preserve"> </w:t>
-      </w:r>
-      <w:r>
-        <w:t xml:space="preserve">makes the result robust to</w:t>
-      </w:r>
-      <w:r>
-        <w:t xml:space="preserve"> </w:t>
-      </w:r>
-      <w:r>
-        <w:t xml:space="preserve">“</w:t>
-      </w:r>
-      <w:r>
-        <w:t xml:space="preserve">previously on…</w:t>
-      </w:r>
-      <w:r>
-        <w:t xml:space="preserve">”</w:t>
-      </w:r>
-      <w:r>
-        <w:t xml:space="preserve"> </w:t>
-      </w:r>
-      <w:r>
-        <w:t xml:space="preserve">recaps, cold opens, ad-break</w:t>
-      </w:r>
-      <w:r>
-        <w:t xml:space="preserve"> </w:t>
-      </w:r>
-      <w:r>
-        <w:t xml:space="preserve">gaps, and extended-cut inserts that could fool a single sample.</w:t>
+        <w:t xml:space="preserve">Phonetically matches the transcribed dialogue</w:t>
+      </w:r>
+      <w:r>
+        <w:t xml:space="preserve"> </w:t>
+      </w:r>
+      <w:r>
+        <w:t xml:space="preserve">against the subtitle-based</w:t>
+      </w:r>
+      <w:r>
+        <w:t xml:space="preserve"> </w:t>
+      </w:r>
+      <w:r>
+        <w:t xml:space="preserve">reference database using Double Metaphone encoding and shingle hashing.</w:t>
       </w:r>
     </w:p>
     <w:p>
@@ -331,25 +295,43 @@
           <w:bCs/>
           <w:b/>
         </w:rPr>
-        <w:t xml:space="preserve">Falls back to dialogue (phonetic) matching</w:t>
-      </w:r>
-      <w:r>
-        <w:t xml:space="preserve"> </w:t>
-      </w:r>
-      <w:r>
-        <w:t xml:space="preserve">only when the acoustic vote is</w:t>
-      </w:r>
-      <w:r>
-        <w:t xml:space="preserve"> </w:t>
-      </w:r>
-      <w:r>
-        <w:t xml:space="preserve">weak or the samples disagree — it transcribes the same clips and matches the</w:t>
-      </w:r>
-      <w:r>
-        <w:t xml:space="preserve"> </w:t>
-      </w:r>
-      <w:r>
-        <w:t xml:space="preserve">words, with an order-preserving fuzzy stage for badly re-encoded audio.</w:t>
+        <w:t xml:space="preserve">Votes</w:t>
+      </w:r>
+      <w:r>
+        <w:t xml:space="preserve"> </w:t>
+      </w:r>
+      <w:r>
+        <w:t xml:space="preserve">across the samples. Requiring several spread-out clips to agree</w:t>
+      </w:r>
+      <w:r>
+        <w:t xml:space="preserve"> </w:t>
+      </w:r>
+      <w:r>
+        <w:t xml:space="preserve">makes the result robust to</w:t>
+      </w:r>
+      <w:r>
+        <w:t xml:space="preserve"> </w:t>
+      </w:r>
+      <w:r>
+        <w:t xml:space="preserve">“</w:t>
+      </w:r>
+      <w:r>
+        <w:t xml:space="preserve">previously on…</w:t>
+      </w:r>
+      <w:r>
+        <w:t xml:space="preserve">”</w:t>
+      </w:r>
+      <w:r>
+        <w:t xml:space="preserve"> </w:t>
+      </w:r>
+      <w:r>
+        <w:t xml:space="preserve">recaps, cold opens, ad-break</w:t>
+      </w:r>
+      <w:r>
+        <w:t xml:space="preserve"> </w:t>
+      </w:r>
+      <w:r>
+        <w:t xml:space="preserve">gaps, and extended-cut inserts that could fool a single sample.</w:t>
       </w:r>
     </w:p>
     <w:p>
@@ -365,13 +347,25 @@
           <w:bCs/>
           <w:b/>
         </w:rPr>
-        <w:t xml:space="preserve">Optionally sanity-checks the runtime</w:t>
-      </w:r>
-      <w:r>
-        <w:t xml:space="preserve"> </w:t>
-      </w:r>
-      <w:r>
-        <w:t xml:space="preserve">against expected episode lengths.</w:t>
+        <w:t xml:space="preserve">Falls back to fuzzy (LCS) phonetic matching</w:t>
+      </w:r>
+      <w:r>
+        <w:t xml:space="preserve"> </w:t>
+      </w:r>
+      <w:r>
+        <w:t xml:space="preserve">when exact shingle matching</w:t>
+      </w:r>
+      <w:r>
+        <w:t xml:space="preserve"> </w:t>
+      </w:r>
+      <w:r>
+        <w:t xml:space="preserve">is weak - this tolerates dropped, mis-heard, or inserted words from noisy</w:t>
+      </w:r>
+      <w:r>
+        <w:t xml:space="preserve"> </w:t>
+      </w:r>
+      <w:r>
+        <w:t xml:space="preserve">speech-to-text output.</w:t>
       </w:r>
     </w:p>
     <w:p>
@@ -383,6 +377,28 @@
         <w:pStyle w:val="Compact"/>
       </w:pPr>
       <w:r>
+        <w:rPr>
+          <w:bCs/>
+          <w:b/>
+        </w:rPr>
+        <w:t xml:space="preserve">Optionally sanity-checks the runtime</w:t>
+      </w:r>
+      <w:r>
+        <w:t xml:space="preserve"> </w:t>
+      </w:r>
+      <w:r>
+        <w:t xml:space="preserve">against expected episode lengths.</w:t>
+      </w:r>
+    </w:p>
+    <w:p>
+      <w:pPr>
+        <w:numPr>
+          <w:ilvl w:val="0"/>
+          <w:numId w:val="1001"/>
+        </w:numPr>
+        <w:pStyle w:val="Compact"/>
+      </w:pPr>
+      <w:r>
         <w:t xml:space="preserve">Writes a</w:t>
       </w:r>
       <w:r>
@@ -394,7 +410,7 @@
           <w:bCs/>
           <w:b/>
         </w:rPr>
-        <w:t xml:space="preserve">filename → episode</w:t>
+        <w:t xml:space="preserve">filename -&gt; episode</w:t>
       </w:r>
       <w:r>
         <w:rPr>
@@ -436,278 +452,99 @@
         <w:t xml:space="preserve">.</w:t>
       </w:r>
     </w:p>
+    <w:bookmarkStart w:id="20" w:name="parallel-processing"/>
+    <w:p>
+      <w:pPr>
+        <w:pStyle w:val="Heading3"/>
+      </w:pPr>
+      <w:r>
+        <w:t xml:space="preserve">Parallel processing</w:t>
+      </w:r>
+    </w:p>
     <w:p>
       <w:pPr>
         <w:pStyle w:val="FirstParagraph"/>
       </w:pPr>
       <w:r>
-        <w:rPr>
-          <w:bCs/>
-          <w:b/>
-        </w:rPr>
-        <w:t xml:space="preserve">Why this combination</w:t>
-      </w:r>
-      <w:r>
-        <w:t xml:space="preserve"> </w:t>
-      </w:r>
-      <w:r>
-        <w:t xml:space="preserve">(researched against the alternatives):</w:t>
-      </w:r>
-    </w:p>
-    <w:tbl>
-      <w:tblPr>
-        <w:tblStyle w:val="Table"/>
-        <w:tblW w:type="pct" w:w="5000"/>
-        <w:tblLook w:firstRow="1" w:lastRow="0" w:firstColumn="0" w:lastColumn="0" w:noHBand="0" w:noVBand="0" w:val="0020"/>
-      </w:tblPr>
-      <w:tblGrid>
-        <w:gridCol w:w="2140"/>
-        <w:gridCol w:w="5779"/>
-      </w:tblGrid>
-      <w:tr>
-        <w:trPr>
-          <w:tblHeader w:val="true"/>
-        </w:trPr>
-        <w:tc>
-          <w:tcPr/>
-          <w:p>
-            <w:pPr>
-              <w:pStyle w:val="Compact"/>
-              <w:jc w:val="left"/>
-            </w:pPr>
-            <w:r>
-              <w:t xml:space="preserve">Approach</w:t>
-            </w:r>
-          </w:p>
-        </w:tc>
-        <w:tc>
-          <w:tcPr/>
-          <w:p>
-            <w:pPr>
-              <w:pStyle w:val="Compact"/>
-              <w:jc w:val="left"/>
-            </w:pPr>
-            <w:r>
-              <w:t xml:space="preserve">Verdict for this use case</w:t>
-            </w:r>
-          </w:p>
-        </w:tc>
-      </w:tr>
-      <w:tr>
-        <w:tc>
-          <w:tcPr/>
-          <w:p>
-            <w:pPr>
-              <w:pStyle w:val="Compact"/>
-              <w:jc w:val="left"/>
-            </w:pPr>
-            <w:r>
-              <w:rPr>
-                <w:bCs/>
-                <w:b/>
-              </w:rPr>
-              <w:t xml:space="preserve">Multi-point acoustic sampling</w:t>
-            </w:r>
-          </w:p>
-        </w:tc>
-        <w:tc>
-          <w:tcPr/>
-          <w:p>
-            <w:pPr>
-              <w:pStyle w:val="Compact"/>
-              <w:jc w:val="left"/>
-            </w:pPr>
-            <w:r>
-              <w:t xml:space="preserve">✅</w:t>
-            </w:r>
-            <w:r>
-              <w:t xml:space="preserve"> </w:t>
-            </w:r>
-            <w:r>
-              <w:rPr>
-                <w:bCs/>
-                <w:b/>
-              </w:rPr>
-              <w:t xml:space="preserve">Primary.</w:t>
-            </w:r>
-            <w:r>
-              <w:t xml:space="preserve"> </w:t>
-            </w:r>
-            <w:r>
-              <w:t xml:space="preserve">Fast, accurate on clean rips, reuses the audio you already fingerprint. Sampling + voting handles extended cuts and recaps.</w:t>
-            </w:r>
-          </w:p>
-        </w:tc>
-      </w:tr>
-      <w:tr>
-        <w:tc>
-          <w:tcPr/>
-          <w:p>
-            <w:pPr>
-              <w:pStyle w:val="Compact"/>
-              <w:jc w:val="left"/>
-            </w:pPr>
-            <w:r>
-              <w:rPr>
-                <w:bCs/>
-                <w:b/>
-              </w:rPr>
-              <w:t xml:space="preserve">Phonetic (dialogue) matching</w:t>
-            </w:r>
-          </w:p>
-        </w:tc>
-        <w:tc>
-          <w:tcPr/>
-          <w:p>
-            <w:pPr>
-              <w:pStyle w:val="Compact"/>
-              <w:jc w:val="left"/>
-            </w:pPr>
-            <w:r>
-              <w:t xml:space="preserve">✅</w:t>
-            </w:r>
-            <w:r>
-              <w:t xml:space="preserve"> </w:t>
-            </w:r>
-            <w:r>
-              <w:rPr>
-                <w:bCs/>
-                <w:b/>
-              </w:rPr>
-              <w:t xml:space="preserve">Fallback.</w:t>
-            </w:r>
-            <w:r>
-              <w:t xml:space="preserve"> </w:t>
-            </w:r>
-            <w:r>
-              <w:t xml:space="preserve">Rescues aggressively re-encoded audio where acoustic hashes drift. Scoped to the acoustic shortlist so it stays fast.</w:t>
-            </w:r>
-          </w:p>
-        </w:tc>
-      </w:tr>
-      <w:tr>
-        <w:tc>
-          <w:tcPr/>
-          <w:p>
-            <w:pPr>
-              <w:pStyle w:val="Compact"/>
-              <w:jc w:val="left"/>
-            </w:pPr>
-            <w:r>
-              <w:rPr>
-                <w:bCs/>
-                <w:b/>
-              </w:rPr>
-              <w:t xml:space="preserve">Runtime comparison</w:t>
-            </w:r>
-          </w:p>
-        </w:tc>
-        <w:tc>
-          <w:tcPr/>
-          <w:p>
-            <w:pPr>
-              <w:pStyle w:val="Compact"/>
-              <w:jc w:val="left"/>
-            </w:pPr>
-            <w:r>
-              <w:t xml:space="preserve">➖</w:t>
-            </w:r>
-            <w:r>
-              <w:t xml:space="preserve"> </w:t>
-            </w:r>
-            <w:r>
-              <w:rPr>
-                <w:bCs/>
-                <w:b/>
-              </w:rPr>
-              <w:t xml:space="preserve">Secondary sanity check only</w:t>
-            </w:r>
-            <w:r>
-              <w:t xml:space="preserve"> </w:t>
-            </w:r>
-            <w:r>
-              <w:t xml:space="preserve">— too coarse alone (many episodes share a runtime), but great for catching extended cuts / confidently-wrong matches.</w:t>
-            </w:r>
-          </w:p>
-        </w:tc>
-      </w:tr>
-      <w:tr>
-        <w:tc>
-          <w:tcPr/>
-          <w:p>
-            <w:pPr>
-              <w:pStyle w:val="Compact"/>
-              <w:jc w:val="left"/>
-            </w:pPr>
-            <w:r>
-              <w:rPr>
-                <w:bCs/>
-                <w:b/>
-              </w:rPr>
-              <w:t xml:space="preserve">OCR of on-screen title cards</w:t>
-            </w:r>
-          </w:p>
-        </w:tc>
-        <w:tc>
-          <w:tcPr/>
-          <w:p>
-            <w:pPr>
-              <w:pStyle w:val="Compact"/>
-              <w:jc w:val="left"/>
-            </w:pPr>
-            <w:r>
-              <w:t xml:space="preserve">❌ Most episodic TV (incl. Matlock) never shows the episode</w:t>
-            </w:r>
-            <w:r>
-              <w:t xml:space="preserve"> </w:t>
-            </w:r>
-            <w:r>
-              <w:rPr>
-                <w:iCs/>
-                <w:i/>
-              </w:rPr>
-              <w:t xml:space="preserve">title</w:t>
-            </w:r>
-            <w:r>
-              <w:t xml:space="preserve"> </w:t>
-            </w:r>
-            <w:r>
-              <w:t xml:space="preserve">on screen — nothing to read.</w:t>
-            </w:r>
-          </w:p>
-        </w:tc>
-      </w:tr>
-      <w:tr>
-        <w:tc>
-          <w:tcPr/>
-          <w:p>
-            <w:pPr>
-              <w:pStyle w:val="Compact"/>
-              <w:jc w:val="left"/>
-            </w:pPr>
-            <w:r>
-              <w:rPr>
-                <w:bCs/>
-                <w:b/>
-              </w:rPr>
-              <w:t xml:space="preserve">Visual / frame fingerprinting</w:t>
-            </w:r>
-          </w:p>
-        </w:tc>
-        <w:tc>
-          <w:tcPr/>
-          <w:p>
-            <w:pPr>
-              <w:pStyle w:val="Compact"/>
-              <w:jc w:val="left"/>
-            </w:pPr>
-            <w:r>
-              <w:t xml:space="preserve">❌ Heavy (frame extraction + perceptual hashing) and needs a visual reference we don’t have; audio is already a strong, cheap signal.</w:t>
-            </w:r>
-          </w:p>
-        </w:tc>
-      </w:tr>
-    </w:tbl>
+        <w:t xml:space="preserve">When identifying many files, use the</w:t>
+      </w:r>
+      <w:r>
+        <w:t xml:space="preserve"> </w:t>
+      </w:r>
+      <w:r>
+        <w:rPr>
+          <w:rStyle w:val="VerbatimChar"/>
+        </w:rPr>
+        <w:t xml:space="preserve">--workers</w:t>
+      </w:r>
+      <w:r>
+        <w:t xml:space="preserve"> </w:t>
+      </w:r>
+      <w:r>
+        <w:t xml:space="preserve">flag to process multiple files</w:t>
+      </w:r>
+      <w:r>
+        <w:t xml:space="preserve"> </w:t>
+      </w:r>
+      <w:r>
+        <w:t xml:space="preserve">in parallel:</w:t>
+      </w:r>
+    </w:p>
+    <w:p>
+      <w:pPr>
+        <w:pStyle w:val="SourceCode"/>
+      </w:pPr>
+      <w:r>
+        <w:rPr>
+          <w:rStyle w:val="ExtensionTok"/>
+        </w:rPr>
+        <w:t xml:space="preserve">python</w:t>
+      </w:r>
+      <w:r>
+        <w:rPr>
+          <w:rStyle w:val="NormalTok"/>
+        </w:rPr>
+        <w:t xml:space="preserve"> identify_dvd_episodes.py </w:t>
+      </w:r>
+      <w:r>
+        <w:rPr>
+          <w:rStyle w:val="AttributeTok"/>
+        </w:rPr>
+        <w:t xml:space="preserve">--dir</w:t>
+      </w:r>
+      <w:r>
+        <w:rPr>
+          <w:rStyle w:val="NormalTok"/>
+        </w:rPr>
+        <w:t xml:space="preserve"> /path/to/dvd_rips </w:t>
+      </w:r>
+      <w:r>
+        <w:rPr>
+          <w:rStyle w:val="AttributeTok"/>
+        </w:rPr>
+        <w:t xml:space="preserve">--workers</w:t>
+      </w:r>
+      <w:r>
+        <w:rPr>
+          <w:rStyle w:val="NormalTok"/>
+        </w:rPr>
+        <w:t xml:space="preserve"> 4</w:t>
+      </w:r>
+    </w:p>
+    <w:p>
+      <w:pPr>
+        <w:pStyle w:val="FirstParagraph"/>
+      </w:pPr>
+      <w:r>
+        <w:t xml:space="preserve">Each worker handles one file independently, so on a multi-core machine this can</w:t>
+      </w:r>
+      <w:r>
+        <w:t xml:space="preserve"> </w:t>
+      </w:r>
+      <w:r>
+        <w:t xml:space="preserve">cut total processing time significantly.</w:t>
+      </w:r>
+    </w:p>
     <w:p>
       <w:r>
         <w:pict>
@@ -716,13 +553,14 @@
       </w:r>
     </w:p>
     <w:bookmarkEnd w:id="20"/>
-    <w:bookmarkStart w:id="24" w:name="Xca21f9f55b42734db16460fa1520f730289ee27"/>
+    <w:bookmarkEnd w:id="21"/>
+    <w:bookmarkStart w:id="24" w:name="X6b411ab8a12c871b504fc93ab336e936b6f95c6"/>
     <w:p>
       <w:pPr>
         <w:pStyle w:val="Heading2"/>
       </w:pPr>
       <w:r>
-        <w:t xml:space="preserve">Step 1 — Build the reference database from subtitles</w:t>
+        <w:t xml:space="preserve">Step 1 - Build the reference database from subtitles</w:t>
       </w:r>
     </w:p>
     <w:p>
@@ -739,7 +577,7 @@
         <w:t xml:space="preserve">fingerprint them.</w:t>
       </w:r>
     </w:p>
-    <w:bookmarkStart w:id="21" w:name="get-the-srt-files"/>
+    <w:bookmarkStart w:id="22" w:name="get-the-srt-files"/>
     <w:p>
       <w:pPr>
         <w:pStyle w:val="Heading3"/>
@@ -910,8 +748,8 @@
         <w:t xml:space="preserve">Matlock (1986) - S01E04 - The Stripper.srt</w:t>
       </w:r>
     </w:p>
-    <w:bookmarkEnd w:id="21"/>
-    <w:bookmarkStart w:id="22" w:name="X398ab8c1637b98bf49e3fa9d52ebef2aedb1ac9"/>
+    <w:bookmarkEnd w:id="22"/>
+    <w:bookmarkStart w:id="23" w:name="X398ab8c1637b98bf49e3fa9d52ebef2aedb1ac9"/>
     <w:p>
       <w:pPr>
         <w:pStyle w:val="Heading3"/>
@@ -949,28 +787,12 @@
         <w:t xml:space="preserve"> /path/to/subtitles</w:t>
       </w:r>
     </w:p>
-    <w:bookmarkEnd w:id="22"/>
-    <w:bookmarkStart w:id="23" w:name="Xbf774d6a52466ecc78f63ab28c8caf892c5a8a6"/>
-    <w:p>
-      <w:pPr>
-        <w:pStyle w:val="Heading3"/>
-      </w:pPr>
-      <w:r>
-        <w:t xml:space="preserve">(Recommended) Also fingerprint the clean rips acoustically</w:t>
-      </w:r>
-    </w:p>
     <w:p>
       <w:pPr>
         <w:pStyle w:val="FirstParagraph"/>
       </w:pPr>
       <w:r>
-        <w:t xml:space="preserve">The acoustic stage needs an acoustic reference. If you have any known-good copy</w:t>
-      </w:r>
-      <w:r>
-        <w:t xml:space="preserve"> </w:t>
-      </w:r>
-      <w:r>
-        <w:t xml:space="preserve">of the episodes (even one clean rip per episode), fingerprint it:</w:t>
+        <w:t xml:space="preserve">Check what’s in the DB anytime:</w:t>
       </w:r>
     </w:p>
     <w:p>
@@ -987,131 +809,13 @@
         <w:rPr>
           <w:rStyle w:val="NormalTok"/>
         </w:rPr>
-        <w:t xml:space="preserve"> create_acoustic_fingerprint.py </w:t>
+        <w:t xml:space="preserve"> create_fingerprint.py </w:t>
       </w:r>
       <w:r>
         <w:rPr>
           <w:rStyle w:val="AttributeTok"/>
         </w:rPr>
-        <w:t xml:space="preserve">--dir</w:t>
-      </w:r>
-      <w:r>
-        <w:rPr>
-          <w:rStyle w:val="NormalTok"/>
-        </w:rPr>
-        <w:t xml:space="preserve"> /path/to/known_good_episodes</w:t>
-      </w:r>
-    </w:p>
-    <w:p>
-      <w:pPr>
-        <w:pStyle w:val="BlockText"/>
-      </w:pPr>
-      <w:r>
-        <w:t xml:space="preserve">If you only have subtitles (no acoustic reference), the tool still works — it</w:t>
-      </w:r>
-      <w:r>
-        <w:t xml:space="preserve"> </w:t>
-      </w:r>
-      <w:r>
-        <w:t xml:space="preserve">will rely on the</w:t>
-      </w:r>
-      <w:r>
-        <w:t xml:space="preserve"> </w:t>
-      </w:r>
-      <w:r>
-        <w:rPr>
-          <w:bCs/>
-          <w:b/>
-        </w:rPr>
-        <w:t xml:space="preserve">phonetic</w:t>
-      </w:r>
-      <w:r>
-        <w:t xml:space="preserve"> </w:t>
-      </w:r>
-      <w:r>
-        <w:t xml:space="preserve">stage. Acoustic sampling simply won’t have</w:t>
-      </w:r>
-      <w:r>
-        <w:t xml:space="preserve"> </w:t>
-      </w:r>
-      <w:r>
-        <w:t xml:space="preserve">anything to match against, so identification falls back to dialogue matching.</w:t>
-      </w:r>
-    </w:p>
-    <w:p>
-      <w:pPr>
-        <w:pStyle w:val="FirstParagraph"/>
-      </w:pPr>
-      <w:r>
-        <w:t xml:space="preserve">Check what’s in the DB anytime:</w:t>
-      </w:r>
-    </w:p>
-    <w:p>
-      <w:pPr>
-        <w:pStyle w:val="SourceCode"/>
-      </w:pPr>
-      <w:r>
-        <w:rPr>
-          <w:rStyle w:val="ExtensionTok"/>
-        </w:rPr>
-        <w:t xml:space="preserve">python</w:t>
-      </w:r>
-      <w:r>
-        <w:rPr>
-          <w:rStyle w:val="NormalTok"/>
-        </w:rPr>
-        <w:t xml:space="preserve"> create_fingerprint.py </w:t>
-      </w:r>
-      <w:r>
-        <w:rPr>
-          <w:rStyle w:val="AttributeTok"/>
-        </w:rPr>
         <w:t xml:space="preserve">--list</w:t>
-      </w:r>
-      <w:r>
-        <w:rPr>
-          <w:rStyle w:val="NormalTok"/>
-        </w:rPr>
-        <w:t xml:space="preserve">          </w:t>
-      </w:r>
-      <w:r>
-        <w:rPr>
-          <w:rStyle w:val="CommentTok"/>
-        </w:rPr>
-        <w:t xml:space="preserve"># phonetic media</w:t>
-      </w:r>
-      <w:r>
-        <w:br/>
-      </w:r>
-      <w:r>
-        <w:rPr>
-          <w:rStyle w:val="ExtensionTok"/>
-        </w:rPr>
-        <w:t xml:space="preserve">python</w:t>
-      </w:r>
-      <w:r>
-        <w:rPr>
-          <w:rStyle w:val="NormalTok"/>
-        </w:rPr>
-        <w:t xml:space="preserve"> create_acoustic_fingerprint.py </w:t>
-      </w:r>
-      <w:r>
-        <w:rPr>
-          <w:rStyle w:val="AttributeTok"/>
-        </w:rPr>
-        <w:t xml:space="preserve">--list</w:t>
-      </w:r>
-      <w:r>
-        <w:rPr>
-          <w:rStyle w:val="NormalTok"/>
-        </w:rPr>
-        <w:t xml:space="preserve"> </w:t>
-      </w:r>
-      <w:r>
-        <w:rPr>
-          <w:rStyle w:val="CommentTok"/>
-        </w:rPr>
-        <w:t xml:space="preserve"># acoustic media</w:t>
       </w:r>
     </w:p>
     <w:p>
@@ -1123,13 +827,13 @@
     </w:p>
     <w:bookmarkEnd w:id="23"/>
     <w:bookmarkEnd w:id="24"/>
-    <w:bookmarkStart w:id="26" w:name="step-2-batch-identify-your-dvd-rips"/>
+    <w:bookmarkStart w:id="26" w:name="step-2---batch-identify-your-dvd-rips"/>
     <w:p>
       <w:pPr>
         <w:pStyle w:val="Heading2"/>
       </w:pPr>
       <w:r>
-        <w:t xml:space="preserve">Step 2 — Batch-identify your DVD rips</w:t>
+        <w:t xml:space="preserve">Step 2 - Batch-identify your DVD rips</w:t>
       </w:r>
     </w:p>
     <w:p>
@@ -1213,6 +917,94 @@
         <w:pStyle w:val="FirstParagraph"/>
       </w:pPr>
       <w:r>
+        <w:t xml:space="preserve">For faster processing on multi-core machines:</w:t>
+      </w:r>
+    </w:p>
+    <w:p>
+      <w:pPr>
+        <w:pStyle w:val="SourceCode"/>
+      </w:pPr>
+      <w:r>
+        <w:rPr>
+          <w:rStyle w:val="ExtensionTok"/>
+        </w:rPr>
+        <w:t xml:space="preserve">python</w:t>
+      </w:r>
+      <w:r>
+        <w:rPr>
+          <w:rStyle w:val="NormalTok"/>
+        </w:rPr>
+        <w:t xml:space="preserve"> identify_dvd_episodes.py </w:t>
+      </w:r>
+      <w:r>
+        <w:rPr>
+          <w:rStyle w:val="AttributeTok"/>
+        </w:rPr>
+        <w:t xml:space="preserve">--dir</w:t>
+      </w:r>
+      <w:r>
+        <w:rPr>
+          <w:rStyle w:val="NormalTok"/>
+        </w:rPr>
+        <w:t xml:space="preserve"> /path/to/dvd_rips </w:t>
+      </w:r>
+      <w:r>
+        <w:rPr>
+          <w:rStyle w:val="DataTypeTok"/>
+        </w:rPr>
+        <w:t xml:space="preserve">\</w:t>
+      </w:r>
+      <w:r>
+        <w:br/>
+      </w:r>
+      <w:r>
+        <w:rPr>
+          <w:rStyle w:val="NormalTok"/>
+        </w:rPr>
+        <w:t xml:space="preserve">    </w:t>
+      </w:r>
+      <w:r>
+        <w:rPr>
+          <w:rStyle w:val="AttributeTok"/>
+        </w:rPr>
+        <w:t xml:space="preserve">--csv</w:t>
+      </w:r>
+      <w:r>
+        <w:rPr>
+          <w:rStyle w:val="NormalTok"/>
+        </w:rPr>
+        <w:t xml:space="preserve"> episode_map.csv </w:t>
+      </w:r>
+      <w:r>
+        <w:rPr>
+          <w:rStyle w:val="AttributeTok"/>
+        </w:rPr>
+        <w:t xml:space="preserve">--json</w:t>
+      </w:r>
+      <w:r>
+        <w:rPr>
+          <w:rStyle w:val="NormalTok"/>
+        </w:rPr>
+        <w:t xml:space="preserve"> episode_map.json </w:t>
+      </w:r>
+      <w:r>
+        <w:rPr>
+          <w:rStyle w:val="AttributeTok"/>
+        </w:rPr>
+        <w:t xml:space="preserve">--workers</w:t>
+      </w:r>
+      <w:r>
+        <w:rPr>
+          <w:rStyle w:val="NormalTok"/>
+        </w:rPr>
+        <w:t xml:space="preserve"> 4</w:t>
+      </w:r>
+    </w:p>
+    <w:p>
+      <w:pPr>
+        <w:pStyle w:val="FirstParagraph"/>
+      </w:pPr>
+      <w:r>
         <w:t xml:space="preserve">Example console output:</w:t>
       </w:r>
     </w:p>
@@ -1278,7 +1070,7 @@
         <w:rPr>
           <w:rStyle w:val="VerbatimChar"/>
         </w:rPr>
-        <w:t xml:space="preserve">  phonetic     : on (fallback)</w:t>
+        <w:t xml:space="preserve">  workers      : 4</w:t>
       </w:r>
       <w:r>
         <w:br/>
@@ -1299,7 +1091,7 @@
         <w:rPr>
           <w:rStyle w:val="VerbatimChar"/>
         </w:rPr>
-        <w:t xml:space="preserve">    =&gt; S01E04  Matlock (1986)  [acoustic, conf 71%, 5/5 samples]  ✓</w:t>
+        <w:t xml:space="preserve">    =&gt; S01E04  Matlock (1986)  [phonetic, conf 35%, 4/5 samples]  ✓</w:t>
       </w:r>
       <w:r>
         <w:br/>
@@ -1320,7 +1112,7 @@
         <w:rPr>
           <w:rStyle w:val="VerbatimChar"/>
         </w:rPr>
-        <w:t xml:space="preserve">    =&gt; S01E07  Matlock (1986)  [acoustic, conf 44%, 3/5 samples]  ⚠ REVIEW</w:t>
+        <w:t xml:space="preserve">    =&gt; S01E07  Matlock (1986)  [phonetic, conf 22%, 3/5 samples]  ⚠ REVIEW</w:t>
       </w:r>
       <w:r>
         <w:br/>
@@ -1383,7 +1175,7 @@
         <w:rPr>
           <w:rStyle w:val="VerbatimChar"/>
         </w:rPr>
-        <w:t xml:space="preserve">    ✓ Disc1_Title3.mkv        -&gt; S01E04  (acoustic, 71%)</w:t>
+        <w:t xml:space="preserve">    ✓ Disc1_Title3.mkv        -&gt; S01E04  (phonetic, 35%)</w:t>
       </w:r>
       <w:r>
         <w:br/>
@@ -1612,7 +1404,7 @@
               <w:jc w:val="left"/>
             </w:pPr>
             <w:r>
-              <w:t xml:space="preserve">0.71</w:t>
+              <w:t xml:space="preserve">0.35</w:t>
             </w:r>
           </w:p>
         </w:tc>
@@ -1624,7 +1416,7 @@
               <w:jc w:val="left"/>
             </w:pPr>
             <w:r>
-              <w:t xml:space="preserve">5/5</w:t>
+              <w:t xml:space="preserve">4/5</w:t>
             </w:r>
           </w:p>
         </w:tc>
@@ -1636,7 +1428,7 @@
               <w:jc w:val="left"/>
             </w:pPr>
             <w:r>
-              <w:t xml:space="preserve">acoustic</w:t>
+              <w:t xml:space="preserve">phonetic</w:t>
             </w:r>
           </w:p>
         </w:tc>
@@ -1718,7 +1510,7 @@
               <w:jc w:val="left"/>
             </w:pPr>
             <w:r>
-              <w:t xml:space="preserve">0.44</w:t>
+              <w:t xml:space="preserve">0.22</w:t>
             </w:r>
           </w:p>
         </w:tc>
@@ -1742,7 +1534,7 @@
               <w:jc w:val="left"/>
             </w:pPr>
             <w:r>
-              <w:t xml:space="preserve">acoustic</w:t>
+              <w:t xml:space="preserve">phonetic</w:t>
             </w:r>
           </w:p>
         </w:tc>
@@ -1914,7 +1706,7 @@
               <w:jc w:val="left"/>
             </w:pPr>
             <w:r>
-              <w:t xml:space="preserve">exact sample positions (percent or 0–1 fractions)</w:t>
+              <w:t xml:space="preserve">exact sample positions (percent or 0-1 fractions)</w:t>
             </w:r>
           </w:p>
         </w:tc>
@@ -1960,7 +1752,7 @@
               <w:rPr>
                 <w:rStyle w:val="VerbatimChar"/>
               </w:rPr>
-              <w:t xml:space="preserve">--no-phonetic</w:t>
+              <w:t xml:space="preserve">--workers N</w:t>
             </w:r>
           </w:p>
         </w:tc>
@@ -1972,7 +1764,7 @@
               <w:jc w:val="left"/>
             </w:pPr>
             <w:r>
-              <w:t xml:space="preserve">acoustic only — fastest, skips the dialogue fallback</w:t>
+              <w:t xml:space="preserve">number of parallel worker processes (default 1)</w:t>
             </w:r>
           </w:p>
         </w:tc>
@@ -2138,7 +1930,7 @@
         <w:t xml:space="preserve"> </w:t>
       </w:r>
       <w:r>
-        <w:t xml:space="preserve">— supply a small JSON of expected minutes:</w:t>
+        <w:t xml:space="preserve">- supply a small JSON of expected minutes:</w:t>
       </w:r>
     </w:p>
     <w:p>
@@ -2330,13 +2122,13 @@
     </w:p>
     <w:bookmarkEnd w:id="25"/>
     <w:bookmarkEnd w:id="26"/>
-    <w:bookmarkStart w:id="27" w:name="step-3-handle-low-confidence-matches"/>
+    <w:bookmarkStart w:id="27" w:name="step-3---handle-low-confidence-matches"/>
     <w:p>
       <w:pPr>
         <w:pStyle w:val="Heading2"/>
       </w:pPr>
       <w:r>
-        <w:t xml:space="preserve">Step 3 — Handle low-confidence matches</w:t>
+        <w:t xml:space="preserve">Step 3 - Handle low-confidence matches</w:t>
       </w:r>
     </w:p>
     <w:p>
@@ -2418,19 +2210,19 @@
         <w:t xml:space="preserve"> </w:t>
       </w:r>
       <w:r>
-        <w:t xml:space="preserve">— the audio didn’t match strongly. Often a heavily</w:t>
-      </w:r>
-      <w:r>
-        <w:t xml:space="preserve"> </w:t>
-      </w:r>
-      <w:r>
-        <w:t xml:space="preserve">re-encoded rip; open the file and check the suggested episode, or re-run that</w:t>
-      </w:r>
-      <w:r>
-        <w:t xml:space="preserve"> </w:t>
-      </w:r>
-      <w:r>
-        <w:t xml:space="preserve">one file with more samples:</w:t>
+        <w:t xml:space="preserve">- the dialogue didn’t match strongly. Often a heavily</w:t>
+      </w:r>
+      <w:r>
+        <w:t xml:space="preserve"> </w:t>
+      </w:r>
+      <w:r>
+        <w:t xml:space="preserve">re-encoded rip or a section with little dialogue; open the file and check the</w:t>
+      </w:r>
+      <w:r>
+        <w:t xml:space="preserve"> </w:t>
+      </w:r>
+      <w:r>
+        <w:t xml:space="preserve">suggested episode, or re-run that one file with more samples:</w:t>
       </w:r>
       <w:r>
         <w:t xml:space="preserve"> </w:t>
@@ -2465,7 +2257,7 @@
         <w:t xml:space="preserve"> </w:t>
       </w:r>
       <w:r>
-        <w:t xml:space="preserve">— different parts of the file matched different</w:t>
+        <w:t xml:space="preserve">- different parts of the file matched different</w:t>
       </w:r>
       <w:r>
         <w:t xml:space="preserve"> </w:t>
@@ -2544,7 +2336,7 @@
         <w:t xml:space="preserve"> </w:t>
       </w:r>
       <w:r>
-        <w:t xml:space="preserve">— two episodes got equal votes; check both.</w:t>
+        <w:t xml:space="preserve">- two episodes got equal votes; check both.</w:t>
       </w:r>
     </w:p>
     <w:p>
@@ -2561,13 +2353,13 @@
           <w:bCs/>
           <w:b/>
         </w:rPr>
-        <w:t xml:space="preserve">runtime … vs expected</w:t>
-      </w:r>
-      <w:r>
-        <w:t xml:space="preserve"> </w:t>
-      </w:r>
-      <w:r>
-        <w:t xml:space="preserve">— likely an extended/edited cut, or a wrong match.</w:t>
+        <w:t xml:space="preserve">runtime ... vs expected</w:t>
+      </w:r>
+      <w:r>
+        <w:t xml:space="preserve"> </w:t>
+      </w:r>
+      <w:r>
+        <w:t xml:space="preserve">- likely an extended/edited cut, or a wrong match.</w:t>
       </w:r>
     </w:p>
     <w:p>
@@ -2587,7 +2379,7 @@
         <w:pStyle w:val="Compact"/>
       </w:pPr>
       <w:r>
-        <w:t xml:space="preserve">Increase samples/among longer files:</w:t>
+        <w:t xml:space="preserve">Increase samples for longer files:</w:t>
       </w:r>
       <w:r>
         <w:t xml:space="preserve"> </w:t>
@@ -2611,7 +2403,7 @@
         <w:pStyle w:val="Compact"/>
       </w:pPr>
       <w:r>
-        <w:t xml:space="preserve">Make sure the acoustic reference actually contains those episodes.</w:t>
+        <w:t xml:space="preserve">Make sure subtitles cover all the episodes you are trying to identify.</w:t>
       </w:r>
     </w:p>
     <w:p>
@@ -2659,13 +2451,13 @@
       </w:r>
     </w:p>
     <w:bookmarkEnd w:id="27"/>
-    <w:bookmarkStart w:id="28" w:name="step-4-rename-for-plex"/>
+    <w:bookmarkStart w:id="28" w:name="step-4---rename-for-plex"/>
     <w:p>
       <w:pPr>
         <w:pStyle w:val="Heading2"/>
       </w:pPr>
       <w:r>
-        <w:t xml:space="preserve">Step 4 — Rename for Plex</w:t>
+        <w:t xml:space="preserve">Step 4 - Rename for Plex</w:t>
       </w:r>
     </w:p>
     <w:p>
@@ -3552,7 +3344,7 @@
           <w:bCs/>
           <w:b/>
         </w:rPr>
-        <w:t xml:space="preserve">Plex → library → ⋯ → Scan Library</w:t>
+        <w:t xml:space="preserve">Plex -&gt; library -&gt; … -&gt; Scan</w:t>
       </w:r>
       <w:r>
         <w:rPr>
@@ -3566,7 +3358,7 @@
           <w:bCs/>
           <w:b/>
         </w:rPr>
-        <w:t xml:space="preserve">Files</w:t>
+        <w:t xml:space="preserve">Library Files</w:t>
       </w:r>
       <w:r>
         <w:t xml:space="preserve">), and Plex will match the episodes and pull artwork/metadata.</w:t>
@@ -3597,7 +3389,7 @@
         <w:rPr>
           <w:rStyle w:val="CommentTok"/>
         </w:rPr>
-        <w:t xml:space="preserve"># 1. one-time: build reference DB from subtitles (+ acoustic if available)</w:t>
+        <w:t xml:space="preserve"># 1. one-time: build reference DB from subtitles</w:t>
       </w:r>
       <w:r>
         <w:br/>
@@ -3630,6 +3422,18 @@
         <w:br/>
       </w:r>
       <w:r>
+        <w:br/>
+      </w:r>
+      <w:r>
+        <w:rPr>
+          <w:rStyle w:val="CommentTok"/>
+        </w:rPr>
+        <w:t xml:space="preserve"># 2. identify a whole folder of rips (parallel)</w:t>
+      </w:r>
+      <w:r>
+        <w:br/>
+      </w:r>
+      <w:r>
         <w:rPr>
           <w:rStyle w:val="ExtensionTok"/>
         </w:rPr>
@@ -3639,7 +3443,7 @@
         <w:rPr>
           <w:rStyle w:val="NormalTok"/>
         </w:rPr>
-        <w:t xml:space="preserve"> create_acoustic_fingerprint.py </w:t>
+        <w:t xml:space="preserve"> identify_dvd_episodes.py </w:t>
       </w:r>
       <w:r>
         <w:rPr>
@@ -3651,85 +3455,58 @@
         <w:rPr>
           <w:rStyle w:val="NormalTok"/>
         </w:rPr>
-        <w:t xml:space="preserve"> /path/to/known_good_episodes</w:t>
-      </w:r>
-      <w:r>
-        <w:br/>
-      </w:r>
-      <w:r>
-        <w:br/>
-      </w:r>
-      <w:r>
-        <w:rPr>
-          <w:rStyle w:val="CommentTok"/>
-        </w:rPr>
-        <w:t xml:space="preserve"># 2. identify a whole folder of rips</w:t>
-      </w:r>
-      <w:r>
-        <w:br/>
-      </w:r>
-      <w:r>
-        <w:rPr>
-          <w:rStyle w:val="ExtensionTok"/>
-        </w:rPr>
-        <w:t xml:space="preserve">python</w:t>
-      </w:r>
-      <w:r>
-        <w:rPr>
-          <w:rStyle w:val="NormalTok"/>
-        </w:rPr>
-        <w:t xml:space="preserve"> identify_dvd_episodes.py </w:t>
+        <w:t xml:space="preserve"> /path/to/dvd_rips </w:t>
+      </w:r>
+      <w:r>
+        <w:rPr>
+          <w:rStyle w:val="DataTypeTok"/>
+        </w:rPr>
+        <w:t xml:space="preserve">\</w:t>
+      </w:r>
+      <w:r>
+        <w:br/>
+      </w:r>
+      <w:r>
+        <w:rPr>
+          <w:rStyle w:val="NormalTok"/>
+        </w:rPr>
+        <w:t xml:space="preserve">    </w:t>
       </w:r>
       <w:r>
         <w:rPr>
           <w:rStyle w:val="AttributeTok"/>
         </w:rPr>
-        <w:t xml:space="preserve">--dir</w:t>
-      </w:r>
-      <w:r>
-        <w:rPr>
-          <w:rStyle w:val="NormalTok"/>
-        </w:rPr>
-        <w:t xml:space="preserve"> /path/to/dvd_rips </w:t>
-      </w:r>
-      <w:r>
-        <w:rPr>
-          <w:rStyle w:val="DataTypeTok"/>
-        </w:rPr>
-        <w:t xml:space="preserve">\</w:t>
-      </w:r>
-      <w:r>
-        <w:br/>
-      </w:r>
-      <w:r>
-        <w:rPr>
-          <w:rStyle w:val="NormalTok"/>
-        </w:rPr>
-        <w:t xml:space="preserve">    </w:t>
+        <w:t xml:space="preserve">--csv</w:t>
+      </w:r>
+      <w:r>
+        <w:rPr>
+          <w:rStyle w:val="NormalTok"/>
+        </w:rPr>
+        <w:t xml:space="preserve"> episode_map.csv </w:t>
       </w:r>
       <w:r>
         <w:rPr>
           <w:rStyle w:val="AttributeTok"/>
         </w:rPr>
-        <w:t xml:space="preserve">--csv</w:t>
-      </w:r>
-      <w:r>
-        <w:rPr>
-          <w:rStyle w:val="NormalTok"/>
-        </w:rPr>
-        <w:t xml:space="preserve"> episode_map.csv </w:t>
+        <w:t xml:space="preserve">--json</w:t>
+      </w:r>
+      <w:r>
+        <w:rPr>
+          <w:rStyle w:val="NormalTok"/>
+        </w:rPr>
+        <w:t xml:space="preserve"> episode_map.json </w:t>
       </w:r>
       <w:r>
         <w:rPr>
           <w:rStyle w:val="AttributeTok"/>
         </w:rPr>
-        <w:t xml:space="preserve">--json</w:t>
-      </w:r>
-      <w:r>
-        <w:rPr>
-          <w:rStyle w:val="NormalTok"/>
-        </w:rPr>
-        <w:t xml:space="preserve"> episode_map.json</w:t>
+        <w:t xml:space="preserve">--workers</w:t>
+      </w:r>
+      <w:r>
+        <w:rPr>
+          <w:rStyle w:val="NormalTok"/>
+        </w:rPr>
+        <w:t xml:space="preserve"> 4</w:t>
       </w:r>
       <w:r>
         <w:br/>

</xml_diff>